<commit_message>
update note to be .docx file
</commit_message>
<xml_diff>
--- a/Literature_Review/2026_CVPR_ChordEdit.docx
+++ b/Literature_Review/2026_CVPR_ChordEdit.docx
@@ -26,22 +26,10 @@
           <w:kern w:val="0"/>
           <w:sz w:val="20"/>
           <w:szCs w:val="20"/>
-          <w14:ligatures w14:val="none"/>
-        </w:rPr>
-        <w:t>Lessons Learn</w:t>
-      </w:r>
-      <w:r>
-        <w:rPr>
-          <w:rFonts w:ascii="Tahoma" w:eastAsia="Times New Roman" w:hAnsi="Tahoma" w:cs="Tahoma"/>
-          <w:b/>
-          <w:bCs/>
-          <w:color w:val="1F1F1F"/>
-          <w:kern w:val="0"/>
-          <w:sz w:val="20"/>
-          <w:szCs w:val="20"/>
-          <w14:ligatures w14:val="none"/>
-        </w:rPr>
-        <w:t>ed</w:t>
+          <w:highlight w:val="yellow"/>
+          <w14:ligatures w14:val="none"/>
+        </w:rPr>
+        <w:t>Lessons Learned</w:t>
       </w:r>
     </w:p>
     <w:p>
@@ -92,21 +80,9 @@
           <w:kern w:val="0"/>
           <w:sz w:val="20"/>
           <w:szCs w:val="20"/>
-          <w:bdr w:val="none" w:sz="0" w:space="0" w:color="auto" w:frame="1"/>
-          <w14:ligatures w14:val="none"/>
-        </w:rPr>
-        <w:t>The Lesson:</w:t>
-      </w:r>
-      <w:r>
-        <w:rPr>
-          <w:rFonts w:ascii="Tahoma" w:eastAsia="Times New Roman" w:hAnsi="Tahoma" w:cs="Tahoma"/>
-          <w:color w:val="1F1F1F"/>
-          <w:kern w:val="0"/>
-          <w:sz w:val="20"/>
-          <w:szCs w:val="20"/>
-          <w14:ligatures w14:val="none"/>
-        </w:rPr>
-        <w:t xml:space="preserve"> When adapting old paradigms to newly distilled models, don't just patch up the symptoms; look at the underlying vector physics.</w:t>
+          <w14:ligatures w14:val="none"/>
+        </w:rPr>
+        <w:t>When adapting old paradigms to newly distilled models, don't just patch up the symptoms; look at the underlying vector physics.</w:t>
       </w:r>
     </w:p>
     <w:p>
@@ -135,7 +111,19 @@
           <w:bdr w:val="none" w:sz="0" w:space="0" w:color="auto" w:frame="1"/>
           <w14:ligatures w14:val="none"/>
         </w:rPr>
-        <w:t xml:space="preserve">Application in Paper: Prior attempts to perform one-step text-guided editing on distilled architectures (like SD-Turbo) resulted in horrific structural breakdown and background corruption. Rather than introducing external protective masks or heavy post-processing networks to fix the distortion, the authors analyzed </w:t>
+        <w:t>Application</w:t>
+      </w:r>
+      <w:r>
+        <w:rPr>
+          <w:rFonts w:ascii="Tahoma" w:eastAsia="Times New Roman" w:hAnsi="Tahoma" w:cs="Tahoma"/>
+          <w:color w:val="1F1F1F"/>
+          <w:kern w:val="0"/>
+          <w:sz w:val="20"/>
+          <w:szCs w:val="20"/>
+          <w:bdr w:val="none" w:sz="0" w:space="0" w:color="auto" w:frame="1"/>
+          <w14:ligatures w14:val="none"/>
+        </w:rPr>
+        <w:t xml:space="preserve">: Prior attempts to perform one-step text-guided editing on distilled architectures (like SD-Turbo) resulted in horrific structural breakdown and background corruption. Rather than introducing external protective masks or heavy post-processing networks to fix the distortion, the authors analyzed </w:t>
       </w:r>
       <w:r>
         <w:rPr>
@@ -226,7 +214,7 @@
           <w:bdr w:val="none" w:sz="0" w:space="0" w:color="auto" w:frame="1"/>
           <w14:ligatures w14:val="none"/>
         </w:rPr>
-        <w:t>The Lesson: Complex deep learning artifacts can often be elegantly resolved by mapping the problem to classical mathematical frameworks like Dynamic Optimal Transport (OT).</w:t>
+        <w:t>Complex deep learning artifacts can often be elegantly resolved by mapping the problem to classical mathematical frameworks like Dynamic Optimal Transport (OT).</w:t>
       </w:r>
       <w:r>
         <w:rPr>
@@ -266,7 +254,19 @@
           <w:bdr w:val="none" w:sz="0" w:space="0" w:color="auto" w:frame="1"/>
           <w14:ligatures w14:val="none"/>
         </w:rPr>
-        <w:t>Application in Paper: The authors reframed image editing as a distribution estimation problem under the Benamou-Brenier dynamic OT framework. By treating the chaotic naive drift as a noisy measurement of an ideal, smooth vector field, they derived a strictly convex quadratic surrogate to find a smooth, low-energy trajectory.</w:t>
+        <w:t>Application</w:t>
+      </w:r>
+      <w:r>
+        <w:rPr>
+          <w:rFonts w:ascii="Tahoma" w:eastAsia="Times New Roman" w:hAnsi="Tahoma" w:cs="Tahoma"/>
+          <w:color w:val="1F1F1F"/>
+          <w:kern w:val="0"/>
+          <w:sz w:val="20"/>
+          <w:szCs w:val="20"/>
+          <w:bdr w:val="none" w:sz="0" w:space="0" w:color="auto" w:frame="1"/>
+          <w14:ligatures w14:val="none"/>
+        </w:rPr>
+        <w:t>: The authors reframed image editing as a distribution estimation problem under the Benamou-Brenier dynamic OT framework. By treating the chaotic naive drift as a noisy measurement of an ideal, smooth vector field, they derived a strictly convex quadratic surrogate to find a smooth, low-energy trajectory.</w:t>
       </w:r>
       <w:r>
         <w:rPr>
@@ -328,21 +328,9 @@
           <w:kern w:val="0"/>
           <w:sz w:val="20"/>
           <w:szCs w:val="20"/>
-          <w:bdr w:val="none" w:sz="0" w:space="0" w:color="auto" w:frame="1"/>
-          <w14:ligatures w14:val="none"/>
-        </w:rPr>
-        <w:t>The Lesson:</w:t>
-      </w:r>
-      <w:r>
-        <w:rPr>
-          <w:rFonts w:ascii="Tahoma" w:eastAsia="Times New Roman" w:hAnsi="Tahoma" w:cs="Tahoma"/>
-          <w:color w:val="1F1F1F"/>
-          <w:kern w:val="0"/>
-          <w:sz w:val="20"/>
-          <w:szCs w:val="20"/>
-          <w14:ligatures w14:val="none"/>
-        </w:rPr>
-        <w:t xml:space="preserve"> High variance in Monte Carlo estimation can be mitigated through structural/geometric design rather than throwing more compute (multiple noise samples) at the problem.</w:t>
+          <w14:ligatures w14:val="none"/>
+        </w:rPr>
+        <w:t>High variance in Monte Carlo estimation can be mitigated through structural/geometric design rather than throwing more compute (multiple noise samples) at the problem.</w:t>
       </w:r>
     </w:p>
     <w:p>
@@ -371,7 +359,19 @@
           <w:bdr w:val="none" w:sz="0" w:space="0" w:color="auto" w:frame="1"/>
           <w14:ligatures w14:val="none"/>
         </w:rPr>
-        <w:t>Application in Paper: While classical practices require multiple noise samples (</w:t>
+        <w:t>Application</w:t>
+      </w:r>
+      <w:r>
+        <w:rPr>
+          <w:rFonts w:ascii="Tahoma" w:eastAsia="Times New Roman" w:hAnsi="Tahoma" w:cs="Tahoma"/>
+          <w:color w:val="1F1F1F"/>
+          <w:kern w:val="0"/>
+          <w:sz w:val="20"/>
+          <w:szCs w:val="20"/>
+          <w:bdr w:val="none" w:sz="0" w:space="0" w:color="auto" w:frame="1"/>
+          <w14:ligatures w14:val="none"/>
+        </w:rPr>
+        <w:t>: While classical practices require multiple noise samples (</w:t>
       </w:r>
       <m:oMath>
         <m:r>
@@ -475,9 +475,23 @@
           <w:kern w:val="0"/>
           <w:sz w:val="20"/>
           <w:szCs w:val="20"/>
-          <w14:ligatures w14:val="none"/>
-        </w:rPr>
-        <w:t xml:space="preserve">Key Takeaways </w:t>
+          <w:highlight w:val="yellow"/>
+          <w14:ligatures w14:val="none"/>
+        </w:rPr>
+        <w:t>Key Takeaways</w:t>
+      </w:r>
+      <w:r>
+        <w:rPr>
+          <w:rFonts w:ascii="Tahoma" w:eastAsia="Times New Roman" w:hAnsi="Tahoma" w:cs="Tahoma"/>
+          <w:b/>
+          <w:bCs/>
+          <w:color w:val="1F1F1F"/>
+          <w:kern w:val="0"/>
+          <w:sz w:val="20"/>
+          <w:szCs w:val="20"/>
+          <w14:ligatures w14:val="none"/>
+        </w:rPr>
+        <w:t xml:space="preserve"> </w:t>
       </w:r>
     </w:p>
     <w:p>
@@ -1457,7 +1471,6 @@
     <w:p>
       <w:pPr>
         <w:spacing w:after="0" w:line="240" w:lineRule="auto"/>
-        <w:outlineLvl w:val="2"/>
         <w:rPr>
           <w:rFonts w:ascii="Tahoma" w:eastAsia="Times New Roman" w:hAnsi="Tahoma" w:cs="Tahoma"/>
           <w:b/>
@@ -1466,6 +1479,20 @@
           <w:kern w:val="0"/>
           <w:sz w:val="20"/>
           <w:szCs w:val="20"/>
+          <w:bdr w:val="none" w:sz="0" w:space="0" w:color="auto" w:frame="1"/>
+          <w14:ligatures w14:val="none"/>
+        </w:rPr>
+      </w:pPr>
+    </w:p>
+    <w:p>
+      <w:pPr>
+        <w:spacing w:after="0" w:line="240" w:lineRule="auto"/>
+        <w:rPr>
+          <w:rFonts w:ascii="Tahoma" w:eastAsia="Times New Roman" w:hAnsi="Tahoma" w:cs="Tahoma"/>
+          <w:color w:val="1F1F1F"/>
+          <w:kern w:val="0"/>
+          <w:sz w:val="20"/>
+          <w:szCs w:val="20"/>
           <w14:ligatures w14:val="none"/>
         </w:rPr>
       </w:pPr>
@@ -1482,12 +1509,46 @@
         </w:rPr>
         <w:t>Decoupling Design: Transport vs. Refinement</w:t>
       </w:r>
+      <w:r>
+        <w:rPr>
+          <w:rFonts w:ascii="Tahoma" w:eastAsia="Times New Roman" w:hAnsi="Tahoma" w:cs="Tahoma"/>
+          <w:color w:val="1F1F1F"/>
+          <w:kern w:val="0"/>
+          <w:sz w:val="20"/>
+          <w:szCs w:val="20"/>
+          <w14:ligatures w14:val="none"/>
+        </w:rPr>
+        <w:t xml:space="preserve"> - </w:t>
+      </w:r>
+      <w:r>
+        <w:rPr>
+          <w:rFonts w:ascii="Tahoma" w:eastAsia="Times New Roman" w:hAnsi="Tahoma" w:cs="Tahoma"/>
+          <w:color w:val="1F1F1F"/>
+          <w:kern w:val="0"/>
+          <w:sz w:val="20"/>
+          <w:szCs w:val="20"/>
+          <w:bdr w:val="none" w:sz="0" w:space="0" w:color="auto" w:frame="1"/>
+          <w14:ligatures w14:val="none"/>
+        </w:rPr>
+        <w:t>Future architectures can benefit from ChordEdit's two-stage modular strategy:</w:t>
+      </w:r>
+      <w:r>
+        <w:rPr>
+          <w:rFonts w:ascii="Tahoma" w:eastAsia="Times New Roman" w:hAnsi="Tahoma" w:cs="Tahoma"/>
+          <w:color w:val="1F1F1F"/>
+          <w:kern w:val="0"/>
+          <w:sz w:val="20"/>
+          <w:szCs w:val="20"/>
+          <w14:ligatures w14:val="none"/>
+        </w:rPr>
+        <w:t xml:space="preserve"> </w:t>
+      </w:r>
     </w:p>
     <w:p>
       <w:pPr>
         <w:numPr>
           <w:ilvl w:val="0"/>
-          <w:numId w:val="7"/>
+          <w:numId w:val="11"/>
         </w:numPr>
         <w:spacing w:after="0" w:line="240" w:lineRule="auto"/>
         <w:rPr>
@@ -1502,14 +1563,28 @@
       <w:r>
         <w:rPr>
           <w:rFonts w:ascii="Tahoma" w:eastAsia="Times New Roman" w:hAnsi="Tahoma" w:cs="Tahoma"/>
-          <w:color w:val="1F1F1F"/>
-          <w:kern w:val="0"/>
-          <w:sz w:val="20"/>
-          <w:szCs w:val="20"/>
-          <w:bdr w:val="none" w:sz="0" w:space="0" w:color="auto" w:frame="1"/>
-          <w14:ligatures w14:val="none"/>
-        </w:rPr>
-        <w:t>Future architectures can benefit from ChordEdit's two-stage modular strategy:</w:t>
+          <w:b/>
+          <w:bCs/>
+          <w:color w:val="1F1F1F"/>
+          <w:kern w:val="0"/>
+          <w:sz w:val="20"/>
+          <w:szCs w:val="20"/>
+          <w:bdr w:val="none" w:sz="0" w:space="0" w:color="auto" w:frame="1"/>
+          <w14:ligatures w14:val="none"/>
+        </w:rPr>
+        <w:t xml:space="preserve">Structure-Preserving Transport </w:t>
+      </w:r>
+      <w:r>
+        <w:rPr>
+          <w:rFonts w:ascii="Tahoma" w:eastAsia="Times New Roman" w:hAnsi="Tahoma" w:cs="Tahoma"/>
+          <w:color w:val="1F1F1F"/>
+          <w:kern w:val="0"/>
+          <w:sz w:val="20"/>
+          <w:szCs w:val="20"/>
+          <w:bdr w:val="none" w:sz="0" w:space="0" w:color="auto" w:frame="1"/>
+          <w14:ligatures w14:val="none"/>
+        </w:rPr>
+        <w:t>(NFE = 1): The low-energy CCF moves the image distribution safely to the target domain while preserving non-edited backgrounds.</w:t>
       </w:r>
       <w:r>
         <w:rPr>
@@ -1526,22 +1601,12 @@
     <w:p>
       <w:pPr>
         <w:numPr>
-          <w:ilvl w:val="1"/>
-          <w:numId w:val="7"/>
+          <w:ilvl w:val="0"/>
+          <w:numId w:val="11"/>
         </w:numPr>
         <w:spacing w:after="0" w:line="240" w:lineRule="auto"/>
         <w:rPr>
           <w:rFonts w:ascii="Tahoma" w:eastAsia="Times New Roman" w:hAnsi="Tahoma" w:cs="Tahoma"/>
-          <w:color w:val="1F1F1F"/>
-          <w:kern w:val="0"/>
-          <w:sz w:val="20"/>
-          <w:szCs w:val="20"/>
-          <w14:ligatures w14:val="none"/>
-        </w:rPr>
-      </w:pPr>
-      <w:r>
-        <w:rPr>
-          <w:rFonts w:ascii="Tahoma" w:eastAsia="Times New Roman" w:hAnsi="Tahoma" w:cs="Tahoma"/>
           <w:b/>
           <w:bCs/>
           <w:color w:val="1F1F1F"/>
@@ -1551,47 +1616,6 @@
           <w:bdr w:val="none" w:sz="0" w:space="0" w:color="auto" w:frame="1"/>
           <w14:ligatures w14:val="none"/>
         </w:rPr>
-        <w:t xml:space="preserve">Structure-Preserving Transport </w:t>
-      </w:r>
-      <w:r>
-        <w:rPr>
-          <w:rFonts w:ascii="Tahoma" w:eastAsia="Times New Roman" w:hAnsi="Tahoma" w:cs="Tahoma"/>
-          <w:color w:val="1F1F1F"/>
-          <w:kern w:val="0"/>
-          <w:sz w:val="20"/>
-          <w:szCs w:val="20"/>
-          <w:bdr w:val="none" w:sz="0" w:space="0" w:color="auto" w:frame="1"/>
-          <w14:ligatures w14:val="none"/>
-        </w:rPr>
-        <w:t>(NFE = 1): The low-energy CCF moves the image distribution safely to the target domain while preserving non-edited backgrounds.</w:t>
-      </w:r>
-      <w:r>
-        <w:rPr>
-          <w:rFonts w:ascii="Tahoma" w:eastAsia="Times New Roman" w:hAnsi="Tahoma" w:cs="Tahoma"/>
-          <w:color w:val="1F1F1F"/>
-          <w:kern w:val="0"/>
-          <w:sz w:val="20"/>
-          <w:szCs w:val="20"/>
-          <w14:ligatures w14:val="none"/>
-        </w:rPr>
-        <w:t xml:space="preserve"> </w:t>
-      </w:r>
-    </w:p>
-    <w:p>
-      <w:pPr>
-        <w:numPr>
-          <w:ilvl w:val="1"/>
-          <w:numId w:val="7"/>
-        </w:numPr>
-        <w:spacing w:after="0" w:line="240" w:lineRule="auto"/>
-        <w:rPr>
-          <w:rFonts w:ascii="Tahoma" w:eastAsia="Times New Roman" w:hAnsi="Tahoma" w:cs="Tahoma"/>
-          <w:color w:val="1F1F1F"/>
-          <w:kern w:val="0"/>
-          <w:sz w:val="20"/>
-          <w:szCs w:val="20"/>
-          <w14:ligatures w14:val="none"/>
-        </w:rPr>
       </w:pPr>
       <w:r>
         <w:rPr>
@@ -1617,7 +1641,31 @@
           <w:bdr w:val="none" w:sz="0" w:space="0" w:color="auto" w:frame="1"/>
           <w14:ligatures w14:val="none"/>
         </w:rPr>
-        <w:t>(Optional, NFE = 1): A lightweight, single forward pass using only the target prompt (</w:t>
+        <w:t>(Optional, NFE = 1): A lightweight</w:t>
+      </w:r>
+      <w:r>
+        <w:rPr>
+          <w:rFonts w:ascii="Tahoma" w:eastAsia="Times New Roman" w:hAnsi="Tahoma" w:cs="Tahoma"/>
+          <w:color w:val="1F1F1F"/>
+          <w:kern w:val="0"/>
+          <w:sz w:val="20"/>
+          <w:szCs w:val="20"/>
+          <w:bdr w:val="none" w:sz="0" w:space="0" w:color="auto" w:frame="1"/>
+          <w14:ligatures w14:val="none"/>
+        </w:rPr>
+        <w:t xml:space="preserve"> </w:t>
+      </w:r>
+      <w:r>
+        <w:rPr>
+          <w:rFonts w:ascii="Tahoma" w:eastAsia="Times New Roman" w:hAnsi="Tahoma" w:cs="Tahoma"/>
+          <w:color w:val="1F1F1F"/>
+          <w:kern w:val="0"/>
+          <w:sz w:val="20"/>
+          <w:szCs w:val="20"/>
+          <w:bdr w:val="none" w:sz="0" w:space="0" w:color="auto" w:frame="1"/>
+          <w14:ligatures w14:val="none"/>
+        </w:rPr>
+        <w:t>single forward pass using only the target prompt (</w:t>
       </w:r>
       <m:oMath>
         <m:sSub>
@@ -1671,18 +1719,110 @@
           <w:bdr w:val="none" w:sz="0" w:space="0" w:color="auto" w:frame="1"/>
           <w14:ligatures w14:val="none"/>
         </w:rPr>
-        <w:t>) to amplify target semantics without messing up the geometry established by the transport phase.</w:t>
-      </w:r>
-      <w:r>
-        <w:rPr>
-          <w:rFonts w:ascii="Tahoma" w:eastAsia="Times New Roman" w:hAnsi="Tahoma" w:cs="Tahoma"/>
-          <w:color w:val="1F1F1F"/>
-          <w:kern w:val="0"/>
-          <w:sz w:val="20"/>
-          <w:szCs w:val="20"/>
+        <w:t xml:space="preserve">) to amplify target semantics without messing up the geometry established by </w:t>
+      </w:r>
+      <w:r>
+        <w:rPr>
+          <w:rFonts w:ascii="Tahoma" w:eastAsia="Times New Roman" w:hAnsi="Tahoma" w:cs="Tahoma"/>
+          <w:b/>
+          <w:bCs/>
+          <w:color w:val="1F1F1F"/>
+          <w:kern w:val="0"/>
+          <w:sz w:val="20"/>
+          <w:szCs w:val="20"/>
+          <w:bdr w:val="none" w:sz="0" w:space="0" w:color="auto" w:frame="1"/>
+          <w14:ligatures w14:val="none"/>
+        </w:rPr>
+        <w:t xml:space="preserve">the transport phase. </w:t>
+      </w:r>
+    </w:p>
+    <w:p>
+      <w:pPr>
+        <w:pStyle w:val="ListParagraph"/>
+        <w:numPr>
+          <w:ilvl w:val="0"/>
+          <w:numId w:val="11"/>
+        </w:numPr>
+        <w:spacing w:before="100" w:beforeAutospacing="1" w:after="100" w:afterAutospacing="1" w:line="240" w:lineRule="auto"/>
+        <w:rPr>
+          <w:rFonts w:ascii="Tahoma" w:eastAsia="Times New Roman" w:hAnsi="Tahoma" w:cs="Tahoma"/>
+          <w:b/>
+          <w:bCs/>
+          <w:color w:val="1F1F1F"/>
+          <w:kern w:val="0"/>
+          <w:sz w:val="20"/>
+          <w:szCs w:val="20"/>
+          <w:bdr w:val="none" w:sz="0" w:space="0" w:color="auto" w:frame="1"/>
+          <w14:ligatures w14:val="none"/>
+        </w:rPr>
+      </w:pPr>
+      <w:r>
+        <w:rPr>
+          <w:rFonts w:ascii="Tahoma" w:eastAsia="Times New Roman" w:hAnsi="Tahoma" w:cs="Tahoma"/>
+          <w:b/>
+          <w:bCs/>
+          <w:color w:val="1F1F1F"/>
+          <w:kern w:val="0"/>
+          <w:sz w:val="20"/>
+          <w:szCs w:val="20"/>
+          <w:bdr w:val="none" w:sz="0" w:space="0" w:color="auto" w:frame="1"/>
+          <w14:ligatures w14:val="none"/>
+        </w:rPr>
+        <w:t>Number of Function Evaluations</w:t>
+      </w:r>
+      <w:r>
+        <w:rPr>
+          <w:rFonts w:ascii="Tahoma" w:eastAsia="Times New Roman" w:hAnsi="Tahoma" w:cs="Tahoma" w:hint="cs"/>
+          <w:color w:val="1F1F1F"/>
+          <w:kern w:val="0"/>
+          <w:sz w:val="20"/>
+          <w:szCs w:val="20"/>
+          <w:bdr w:val="none" w:sz="0" w:space="0" w:color="auto" w:frame="1"/>
+          <w:cs/>
           <w14:ligatures w14:val="none"/>
         </w:rPr>
         <w:t xml:space="preserve"> </w:t>
+      </w:r>
+      <w:r>
+        <w:rPr>
+          <w:rFonts w:ascii="Tahoma" w:eastAsia="Times New Roman" w:hAnsi="Tahoma" w:cs="Tahoma"/>
+          <w:color w:val="1F1F1F"/>
+          <w:kern w:val="0"/>
+          <w:sz w:val="20"/>
+          <w:szCs w:val="20"/>
+          <w:bdr w:val="none" w:sz="0" w:space="0" w:color="auto" w:frame="1"/>
+          <w:lang w:val="en-US"/>
+          <w14:ligatures w14:val="none"/>
+        </w:rPr>
+        <w:t>(NFE)</w:t>
+      </w:r>
+      <w:r>
+        <w:rPr>
+          <w:rFonts w:ascii="Tahoma" w:eastAsia="Times New Roman" w:hAnsi="Tahoma" w:cs="Tahoma"/>
+          <w:b/>
+          <w:bCs/>
+          <w:color w:val="1F1F1F"/>
+          <w:kern w:val="0"/>
+          <w:sz w:val="20"/>
+          <w:szCs w:val="20"/>
+          <w:bdr w:val="none" w:sz="0" w:space="0" w:color="auto" w:frame="1"/>
+          <w14:ligatures w14:val="none"/>
+        </w:rPr>
+        <w:t xml:space="preserve"> </w:t>
+      </w:r>
+      <w:r>
+        <w:rPr>
+          <w:rFonts w:ascii="Tahoma" w:eastAsia="Times New Roman" w:hAnsi="Tahoma" w:cs="Tahoma"/>
+          <w:b/>
+          <w:bCs/>
+          <w:color w:val="1F1F1F"/>
+          <w:kern w:val="0"/>
+          <w:sz w:val="20"/>
+          <w:szCs w:val="20"/>
+          <w:bdr w:val="none" w:sz="0" w:space="0" w:color="auto" w:frame="1"/>
+          <w14:ligatures w14:val="none"/>
+        </w:rPr>
+        <w:t>represents the total number of times a generative model executes or queries its underlying neural network to process a single sample (e.g., to generate, modify, or edit an image).</w:t>
       </w:r>
     </w:p>
     <w:p>
@@ -1796,6 +1936,7 @@
           <w:bdr w:val="none" w:sz="0" w:space="0" w:color="auto" w:frame="1"/>
           <w14:ligatures w14:val="none"/>
         </w:rPr>
+        <w:lastRenderedPageBreak/>
         <w:t>Pareto Frontier:</w:t>
       </w:r>
       <w:r>
@@ -1843,17 +1984,7 @@
         <w:spacing w:after="0" w:line="240" w:lineRule="auto"/>
         <w:outlineLvl w:val="1"/>
         <w:rPr>
-          <w:rFonts w:ascii="Tahoma" w:eastAsia="Times New Roman" w:hAnsi="Tahoma" w:cs="Tahoma"/>
-          <w:color w:val="1F1F1F"/>
-          <w:kern w:val="0"/>
-          <w:sz w:val="20"/>
-          <w:szCs w:val="20"/>
-          <w14:ligatures w14:val="none"/>
-        </w:rPr>
-      </w:pPr>
-      <w:r>
-        <w:rPr>
-          <w:rFonts w:ascii="Tahoma" w:eastAsia="Times New Roman" w:hAnsi="Tahoma" w:cs="Tahoma"/>
+          <w:rFonts w:ascii="Apple Color Emoji" w:eastAsia="Times New Roman" w:hAnsi="Apple Color Emoji" w:cs="Apple Color Emoji"/>
           <w:b/>
           <w:bCs/>
           <w:color w:val="1F1F1F"/>
@@ -1862,8 +1993,21 @@
           <w:szCs w:val="20"/>
           <w14:ligatures w14:val="none"/>
         </w:rPr>
-        <w:t>Why This Paper Award</w:t>
-      </w:r>
+      </w:pPr>
+    </w:p>
+    <w:p>
+      <w:pPr>
+        <w:spacing w:after="0" w:line="240" w:lineRule="auto"/>
+        <w:outlineLvl w:val="1"/>
+        <w:rPr>
+          <w:rFonts w:ascii="Tahoma" w:eastAsia="Times New Roman" w:hAnsi="Tahoma" w:cs="Tahoma"/>
+          <w:color w:val="1F1F1F"/>
+          <w:kern w:val="0"/>
+          <w:sz w:val="20"/>
+          <w:szCs w:val="20"/>
+          <w14:ligatures w14:val="none"/>
+        </w:rPr>
+      </w:pPr>
       <w:r>
         <w:rPr>
           <w:rFonts w:ascii="Tahoma" w:eastAsia="Times New Roman" w:hAnsi="Tahoma" w:cs="Tahoma"/>
@@ -1873,31 +2017,34 @@
           <w:kern w:val="0"/>
           <w:sz w:val="20"/>
           <w:szCs w:val="20"/>
-          <w14:ligatures w14:val="none"/>
-        </w:rPr>
-        <w:t xml:space="preserve">ed </w:t>
-      </w:r>
-      <w:r>
-        <w:rPr>
-          <w:rFonts w:ascii="Tahoma" w:eastAsia="Times New Roman" w:hAnsi="Tahoma" w:cs="Tahoma"/>
-          <w:color w:val="1F1F1F"/>
-          <w:kern w:val="0"/>
-          <w:sz w:val="20"/>
-          <w:szCs w:val="20"/>
-          <w14:ligatures w14:val="none"/>
-        </w:rPr>
-        <w:t>(</w:t>
-      </w:r>
-      <w:r>
-        <w:rPr>
-          <w:rFonts w:ascii="Tahoma" w:eastAsia="Times New Roman" w:hAnsi="Tahoma" w:cs="Tahoma"/>
-          <w:color w:val="1F1F1F"/>
-          <w:kern w:val="0"/>
-          <w:sz w:val="20"/>
-          <w:szCs w:val="20"/>
-          <w14:ligatures w14:val="none"/>
-        </w:rPr>
-        <w:t xml:space="preserve">a </w:t>
+          <w:highlight w:val="yellow"/>
+          <w14:ligatures w14:val="none"/>
+        </w:rPr>
+        <w:t>Why This Paper Awarded</w:t>
+      </w:r>
+      <w:r>
+        <w:rPr>
+          <w:rFonts w:ascii="Tahoma" w:eastAsia="Times New Roman" w:hAnsi="Tahoma" w:cs="Tahoma"/>
+          <w:b/>
+          <w:bCs/>
+          <w:color w:val="1F1F1F"/>
+          <w:kern w:val="0"/>
+          <w:sz w:val="20"/>
+          <w:szCs w:val="20"/>
+          <w14:ligatures w14:val="none"/>
+        </w:rPr>
+        <w:t xml:space="preserve"> </w:t>
+      </w:r>
+      <w:r>
+        <w:rPr>
+          <w:rFonts w:ascii="Tahoma" w:eastAsia="Times New Roman" w:hAnsi="Tahoma" w:cs="Tahoma"/>
+          <w:color w:val="1F1F1F"/>
+          <w:kern w:val="0"/>
+          <w:sz w:val="20"/>
+          <w:szCs w:val="20"/>
+          <w14:ligatures w14:val="none"/>
+        </w:rPr>
+        <w:t xml:space="preserve">(a </w:t>
       </w:r>
       <w:r>
         <w:rPr>
@@ -1942,15 +2089,28 @@
       <w:r>
         <w:rPr>
           <w:rFonts w:ascii="Tahoma" w:eastAsia="Times New Roman" w:hAnsi="Tahoma" w:cs="Tahoma"/>
-          <w:color w:val="1F1F1F"/>
-          <w:kern w:val="0"/>
-          <w:sz w:val="20"/>
-          <w:szCs w:val="20"/>
-          <w:bdr w:val="none" w:sz="0" w:space="0" w:color="auto" w:frame="1"/>
-          <w14:ligatures w14:val="none"/>
-        </w:rPr>
-        <w:lastRenderedPageBreak/>
-        <w:t>Eliminated the Hard Trade-offs: It solved the historical trilemma of image editing by delivering a solution that is simultaneously training-free, inversion-free, and one-step real-time capable.</w:t>
+          <w:b/>
+          <w:bCs/>
+          <w:color w:val="1F1F1F"/>
+          <w:kern w:val="0"/>
+          <w:sz w:val="20"/>
+          <w:szCs w:val="20"/>
+          <w:bdr w:val="none" w:sz="0" w:space="0" w:color="auto" w:frame="1"/>
+          <w14:ligatures w14:val="none"/>
+        </w:rPr>
+        <w:t>Eliminated the Hard Trade-offs</w:t>
+      </w:r>
+      <w:r>
+        <w:rPr>
+          <w:rFonts w:ascii="Tahoma" w:eastAsia="Times New Roman" w:hAnsi="Tahoma" w:cs="Tahoma"/>
+          <w:color w:val="1F1F1F"/>
+          <w:kern w:val="0"/>
+          <w:sz w:val="20"/>
+          <w:szCs w:val="20"/>
+          <w:bdr w:val="none" w:sz="0" w:space="0" w:color="auto" w:frame="1"/>
+          <w14:ligatures w14:val="none"/>
+        </w:rPr>
+        <w:t>: It solved the historical trilemma of image editing by delivering a solution that is simultaneously training-free, inversion-free, and one-step real-time capable.</w:t>
       </w:r>
       <w:r>
         <w:rPr>
@@ -1983,14 +2143,28 @@
       <w:r>
         <w:rPr>
           <w:rFonts w:ascii="Tahoma" w:eastAsia="Times New Roman" w:hAnsi="Tahoma" w:cs="Tahoma"/>
-          <w:color w:val="1F1F1F"/>
-          <w:kern w:val="0"/>
-          <w:sz w:val="20"/>
-          <w:szCs w:val="20"/>
-          <w:bdr w:val="none" w:sz="0" w:space="0" w:color="auto" w:frame="1"/>
-          <w14:ligatures w14:val="none"/>
-        </w:rPr>
-        <w:t>True Model Agnosticism: By interacting with models purely as a black-box query system (querying velocity or noise fields), it avoids architectural coupling. This means any future, faster text-to-image foundation model can immediately deploy ChordEdit downstream without alteration.</w:t>
+          <w:b/>
+          <w:bCs/>
+          <w:color w:val="1F1F1F"/>
+          <w:kern w:val="0"/>
+          <w:sz w:val="20"/>
+          <w:szCs w:val="20"/>
+          <w:bdr w:val="none" w:sz="0" w:space="0" w:color="auto" w:frame="1"/>
+          <w14:ligatures w14:val="none"/>
+        </w:rPr>
+        <w:t>True Model Agnosticism</w:t>
+      </w:r>
+      <w:r>
+        <w:rPr>
+          <w:rFonts w:ascii="Tahoma" w:eastAsia="Times New Roman" w:hAnsi="Tahoma" w:cs="Tahoma"/>
+          <w:color w:val="1F1F1F"/>
+          <w:kern w:val="0"/>
+          <w:sz w:val="20"/>
+          <w:szCs w:val="20"/>
+          <w:bdr w:val="none" w:sz="0" w:space="0" w:color="auto" w:frame="1"/>
+          <w14:ligatures w14:val="none"/>
+        </w:rPr>
+        <w:t>: By interacting with models purely as a black-box query system (querying velocity or noise fields), it avoids architectural coupling. This means any future, faster text-to-image foundation model can immediately deploy ChordEdit downstream without alteration.</w:t>
       </w:r>
       <w:r>
         <w:rPr>
@@ -2023,14 +2197,100 @@
       <w:r>
         <w:rPr>
           <w:rFonts w:ascii="Tahoma" w:eastAsia="Times New Roman" w:hAnsi="Tahoma" w:cs="Tahoma"/>
-          <w:color w:val="1F1F1F"/>
-          <w:kern w:val="0"/>
-          <w:sz w:val="20"/>
-          <w:szCs w:val="20"/>
-          <w:bdr w:val="none" w:sz="0" w:space="0" w:color="auto" w:frame="1"/>
-          <w14:ligatures w14:val="none"/>
-        </w:rPr>
-        <w:t>Theoretically Sound, Domestically Tamed: It didn't just present nice visual results; it provided rigorous mathematical guarantees (e.g., global error bounds and contraction proofs), setting a stellar benchmark for how generative AI papers should bridge empirical results with mathematical theory.</w:t>
+          <w:b/>
+          <w:bCs/>
+          <w:color w:val="1F1F1F"/>
+          <w:kern w:val="0"/>
+          <w:sz w:val="20"/>
+          <w:szCs w:val="20"/>
+          <w:bdr w:val="none" w:sz="0" w:space="0" w:color="auto" w:frame="1"/>
+          <w14:ligatures w14:val="none"/>
+        </w:rPr>
+        <w:t>Theoretically Sound</w:t>
+      </w:r>
+      <w:r>
+        <w:rPr>
+          <w:rFonts w:ascii="Tahoma" w:eastAsia="Times New Roman" w:hAnsi="Tahoma" w:cs="Tahoma"/>
+          <w:color w:val="1F1F1F"/>
+          <w:kern w:val="0"/>
+          <w:sz w:val="20"/>
+          <w:szCs w:val="20"/>
+          <w:bdr w:val="none" w:sz="0" w:space="0" w:color="auto" w:frame="1"/>
+          <w14:ligatures w14:val="none"/>
+        </w:rPr>
+        <w:t>:</w:t>
+      </w:r>
+      <w:r>
+        <w:rPr>
+          <w:rFonts w:ascii="Tahoma" w:eastAsia="Times New Roman" w:hAnsi="Tahoma" w:cs="Tahoma"/>
+          <w:color w:val="1F1F1F"/>
+          <w:kern w:val="0"/>
+          <w:sz w:val="20"/>
+          <w:szCs w:val="20"/>
+          <w:bdr w:val="none" w:sz="0" w:space="0" w:color="auto" w:frame="1"/>
+          <w14:ligatures w14:val="none"/>
+        </w:rPr>
+        <w:t xml:space="preserve"> </w:t>
+      </w:r>
+      <w:r>
+        <w:rPr>
+          <w:rFonts w:ascii="Tahoma" w:eastAsia="Times New Roman" w:hAnsi="Tahoma" w:cs="Tahoma"/>
+          <w:color w:val="1F1F1F"/>
+          <w:kern w:val="0"/>
+          <w:sz w:val="20"/>
+          <w:szCs w:val="20"/>
+          <w:bdr w:val="none" w:sz="0" w:space="0" w:color="auto" w:frame="1"/>
+          <w14:ligatures w14:val="none"/>
+        </w:rPr>
+        <w:t xml:space="preserve"> It didn't just present nice visual results</w:t>
+      </w:r>
+      <w:r>
+        <w:rPr>
+          <w:rFonts w:ascii="Tahoma" w:eastAsia="Times New Roman" w:hAnsi="Tahoma" w:cs="Tahoma"/>
+          <w:color w:val="1F1F1F"/>
+          <w:kern w:val="0"/>
+          <w:sz w:val="20"/>
+          <w:szCs w:val="20"/>
+          <w:bdr w:val="none" w:sz="0" w:space="0" w:color="auto" w:frame="1"/>
+          <w14:ligatures w14:val="none"/>
+        </w:rPr>
+        <w:t>.</w:t>
+      </w:r>
+      <w:r>
+        <w:rPr>
+          <w:rFonts w:ascii="Tahoma" w:eastAsia="Times New Roman" w:hAnsi="Tahoma" w:cs="Tahoma"/>
+          <w:color w:val="1F1F1F"/>
+          <w:kern w:val="0"/>
+          <w:sz w:val="20"/>
+          <w:szCs w:val="20"/>
+          <w:bdr w:val="none" w:sz="0" w:space="0" w:color="auto" w:frame="1"/>
+          <w14:ligatures w14:val="none"/>
+        </w:rPr>
+        <w:t xml:space="preserve"> </w:t>
+      </w:r>
+      <w:r>
+        <w:rPr>
+          <w:rFonts w:ascii="Tahoma" w:eastAsia="Times New Roman" w:hAnsi="Tahoma" w:cs="Tahoma"/>
+          <w:color w:val="1F1F1F"/>
+          <w:kern w:val="0"/>
+          <w:sz w:val="20"/>
+          <w:szCs w:val="20"/>
+          <w:bdr w:val="none" w:sz="0" w:space="0" w:color="auto" w:frame="1"/>
+          <w14:ligatures w14:val="none"/>
+        </w:rPr>
+        <w:t>I</w:t>
+      </w:r>
+      <w:r>
+        <w:rPr>
+          <w:rFonts w:ascii="Tahoma" w:eastAsia="Times New Roman" w:hAnsi="Tahoma" w:cs="Tahoma"/>
+          <w:color w:val="1F1F1F"/>
+          <w:kern w:val="0"/>
+          <w:sz w:val="20"/>
+          <w:szCs w:val="20"/>
+          <w:bdr w:val="none" w:sz="0" w:space="0" w:color="auto" w:frame="1"/>
+          <w14:ligatures w14:val="none"/>
+        </w:rPr>
+        <w:t>t provided rigorous mathematical guarantees (e.g., global error bounds and contraction proofs), setting a stellar benchmark for how generative AI papers should bridge empirical results with mathematical theory.</w:t>
       </w:r>
       <w:r>
         <w:rPr>
@@ -2046,11 +2306,17 @@
     </w:p>
     <w:p>
       <w:pPr>
-        <w:rPr>
-          <w:rFonts w:ascii="Tahoma" w:hAnsi="Tahoma" w:cs="Tahoma"/>
-          <w:sz w:val="20"/>
-          <w:szCs w:val="20"/>
-          <w:lang w:val="en-US"/>
+        <w:spacing w:before="100" w:beforeAutospacing="1" w:after="100" w:afterAutospacing="1" w:line="240" w:lineRule="auto"/>
+        <w:rPr>
+          <w:rFonts w:ascii="Tahoma" w:eastAsia="Times New Roman" w:hAnsi="Tahoma" w:cs="Tahoma"/>
+          <w:b/>
+          <w:bCs/>
+          <w:color w:val="1F1F1F"/>
+          <w:kern w:val="0"/>
+          <w:sz w:val="20"/>
+          <w:szCs w:val="20"/>
+          <w:bdr w:val="none" w:sz="0" w:space="0" w:color="auto" w:frame="1"/>
+          <w14:ligatures w14:val="none"/>
         </w:rPr>
       </w:pPr>
     </w:p>
@@ -2623,6 +2889,296 @@
     </w:lvl>
   </w:abstractNum>
   <w:abstractNum w:abstractNumId="4" w15:restartNumberingAfterBreak="0">
+    <w:nsid w:val="5CB54EB3"/>
+    <w:multiLevelType w:val="multilevel"/>
+    <w:tmpl w:val="73367412"/>
+    <w:lvl w:ilvl="0">
+      <w:start w:val="1"/>
+      <w:numFmt w:val="bullet"/>
+      <w:lvlText w:val=""/>
+      <w:lvlJc w:val="left"/>
+      <w:pPr>
+        <w:tabs>
+          <w:tab w:val="num" w:pos="720"/>
+        </w:tabs>
+        <w:ind w:left="720" w:hanging="360"/>
+      </w:pPr>
+      <w:rPr>
+        <w:rFonts w:ascii="Symbol" w:hAnsi="Symbol" w:hint="default"/>
+        <w:sz w:val="20"/>
+      </w:rPr>
+    </w:lvl>
+    <w:lvl w:ilvl="1">
+      <w:start w:val="1"/>
+      <w:numFmt w:val="bullet"/>
+      <w:lvlText w:val="o"/>
+      <w:lvlJc w:val="left"/>
+      <w:pPr>
+        <w:ind w:left="1440" w:hanging="360"/>
+      </w:pPr>
+      <w:rPr>
+        <w:rFonts w:ascii="Courier New" w:hAnsi="Courier New" w:cs="Courier New" w:hint="default"/>
+      </w:rPr>
+    </w:lvl>
+    <w:lvl w:ilvl="2" w:tentative="1">
+      <w:start w:val="1"/>
+      <w:numFmt w:val="bullet"/>
+      <w:lvlText w:val=""/>
+      <w:lvlJc w:val="left"/>
+      <w:pPr>
+        <w:tabs>
+          <w:tab w:val="num" w:pos="2160"/>
+        </w:tabs>
+        <w:ind w:left="2160" w:hanging="360"/>
+      </w:pPr>
+      <w:rPr>
+        <w:rFonts w:ascii="Wingdings" w:hAnsi="Wingdings" w:hint="default"/>
+        <w:sz w:val="20"/>
+      </w:rPr>
+    </w:lvl>
+    <w:lvl w:ilvl="3" w:tentative="1">
+      <w:start w:val="1"/>
+      <w:numFmt w:val="bullet"/>
+      <w:lvlText w:val=""/>
+      <w:lvlJc w:val="left"/>
+      <w:pPr>
+        <w:tabs>
+          <w:tab w:val="num" w:pos="2880"/>
+        </w:tabs>
+        <w:ind w:left="2880" w:hanging="360"/>
+      </w:pPr>
+      <w:rPr>
+        <w:rFonts w:ascii="Wingdings" w:hAnsi="Wingdings" w:hint="default"/>
+        <w:sz w:val="20"/>
+      </w:rPr>
+    </w:lvl>
+    <w:lvl w:ilvl="4" w:tentative="1">
+      <w:start w:val="1"/>
+      <w:numFmt w:val="bullet"/>
+      <w:lvlText w:val=""/>
+      <w:lvlJc w:val="left"/>
+      <w:pPr>
+        <w:tabs>
+          <w:tab w:val="num" w:pos="3600"/>
+        </w:tabs>
+        <w:ind w:left="3600" w:hanging="360"/>
+      </w:pPr>
+      <w:rPr>
+        <w:rFonts w:ascii="Wingdings" w:hAnsi="Wingdings" w:hint="default"/>
+        <w:sz w:val="20"/>
+      </w:rPr>
+    </w:lvl>
+    <w:lvl w:ilvl="5" w:tentative="1">
+      <w:start w:val="1"/>
+      <w:numFmt w:val="bullet"/>
+      <w:lvlText w:val=""/>
+      <w:lvlJc w:val="left"/>
+      <w:pPr>
+        <w:tabs>
+          <w:tab w:val="num" w:pos="4320"/>
+        </w:tabs>
+        <w:ind w:left="4320" w:hanging="360"/>
+      </w:pPr>
+      <w:rPr>
+        <w:rFonts w:ascii="Wingdings" w:hAnsi="Wingdings" w:hint="default"/>
+        <w:sz w:val="20"/>
+      </w:rPr>
+    </w:lvl>
+    <w:lvl w:ilvl="6" w:tentative="1">
+      <w:start w:val="1"/>
+      <w:numFmt w:val="bullet"/>
+      <w:lvlText w:val=""/>
+      <w:lvlJc w:val="left"/>
+      <w:pPr>
+        <w:tabs>
+          <w:tab w:val="num" w:pos="5040"/>
+        </w:tabs>
+        <w:ind w:left="5040" w:hanging="360"/>
+      </w:pPr>
+      <w:rPr>
+        <w:rFonts w:ascii="Wingdings" w:hAnsi="Wingdings" w:hint="default"/>
+        <w:sz w:val="20"/>
+      </w:rPr>
+    </w:lvl>
+    <w:lvl w:ilvl="7" w:tentative="1">
+      <w:start w:val="1"/>
+      <w:numFmt w:val="bullet"/>
+      <w:lvlText w:val=""/>
+      <w:lvlJc w:val="left"/>
+      <w:pPr>
+        <w:tabs>
+          <w:tab w:val="num" w:pos="5760"/>
+        </w:tabs>
+        <w:ind w:left="5760" w:hanging="360"/>
+      </w:pPr>
+      <w:rPr>
+        <w:rFonts w:ascii="Wingdings" w:hAnsi="Wingdings" w:hint="default"/>
+        <w:sz w:val="20"/>
+      </w:rPr>
+    </w:lvl>
+    <w:lvl w:ilvl="8" w:tentative="1">
+      <w:start w:val="1"/>
+      <w:numFmt w:val="bullet"/>
+      <w:lvlText w:val=""/>
+      <w:lvlJc w:val="left"/>
+      <w:pPr>
+        <w:tabs>
+          <w:tab w:val="num" w:pos="6480"/>
+        </w:tabs>
+        <w:ind w:left="6480" w:hanging="360"/>
+      </w:pPr>
+      <w:rPr>
+        <w:rFonts w:ascii="Wingdings" w:hAnsi="Wingdings" w:hint="default"/>
+        <w:sz w:val="20"/>
+      </w:rPr>
+    </w:lvl>
+  </w:abstractNum>
+  <w:abstractNum w:abstractNumId="5" w15:restartNumberingAfterBreak="0">
+    <w:nsid w:val="65483874"/>
+    <w:multiLevelType w:val="multilevel"/>
+    <w:tmpl w:val="98206F2A"/>
+    <w:lvl w:ilvl="0">
+      <w:start w:val="1"/>
+      <w:numFmt w:val="bullet"/>
+      <w:lvlText w:val=""/>
+      <w:lvlJc w:val="left"/>
+      <w:pPr>
+        <w:tabs>
+          <w:tab w:val="num" w:pos="720"/>
+        </w:tabs>
+        <w:ind w:left="720" w:hanging="360"/>
+      </w:pPr>
+      <w:rPr>
+        <w:rFonts w:ascii="Symbol" w:hAnsi="Symbol" w:hint="default"/>
+        <w:sz w:val="20"/>
+      </w:rPr>
+    </w:lvl>
+    <w:lvl w:ilvl="1">
+      <w:start w:val="1"/>
+      <w:numFmt w:val="bullet"/>
+      <w:lvlText w:val=""/>
+      <w:lvlJc w:val="left"/>
+      <w:pPr>
+        <w:ind w:left="1440" w:hanging="360"/>
+      </w:pPr>
+      <w:rPr>
+        <w:rFonts w:ascii="Symbol" w:hAnsi="Symbol" w:hint="default"/>
+      </w:rPr>
+    </w:lvl>
+    <w:lvl w:ilvl="2" w:tentative="1">
+      <w:start w:val="1"/>
+      <w:numFmt w:val="bullet"/>
+      <w:lvlText w:val=""/>
+      <w:lvlJc w:val="left"/>
+      <w:pPr>
+        <w:tabs>
+          <w:tab w:val="num" w:pos="2160"/>
+        </w:tabs>
+        <w:ind w:left="2160" w:hanging="360"/>
+      </w:pPr>
+      <w:rPr>
+        <w:rFonts w:ascii="Wingdings" w:hAnsi="Wingdings" w:hint="default"/>
+        <w:sz w:val="20"/>
+      </w:rPr>
+    </w:lvl>
+    <w:lvl w:ilvl="3" w:tentative="1">
+      <w:start w:val="1"/>
+      <w:numFmt w:val="bullet"/>
+      <w:lvlText w:val=""/>
+      <w:lvlJc w:val="left"/>
+      <w:pPr>
+        <w:tabs>
+          <w:tab w:val="num" w:pos="2880"/>
+        </w:tabs>
+        <w:ind w:left="2880" w:hanging="360"/>
+      </w:pPr>
+      <w:rPr>
+        <w:rFonts w:ascii="Wingdings" w:hAnsi="Wingdings" w:hint="default"/>
+        <w:sz w:val="20"/>
+      </w:rPr>
+    </w:lvl>
+    <w:lvl w:ilvl="4" w:tentative="1">
+      <w:start w:val="1"/>
+      <w:numFmt w:val="bullet"/>
+      <w:lvlText w:val=""/>
+      <w:lvlJc w:val="left"/>
+      <w:pPr>
+        <w:tabs>
+          <w:tab w:val="num" w:pos="3600"/>
+        </w:tabs>
+        <w:ind w:left="3600" w:hanging="360"/>
+      </w:pPr>
+      <w:rPr>
+        <w:rFonts w:ascii="Wingdings" w:hAnsi="Wingdings" w:hint="default"/>
+        <w:sz w:val="20"/>
+      </w:rPr>
+    </w:lvl>
+    <w:lvl w:ilvl="5" w:tentative="1">
+      <w:start w:val="1"/>
+      <w:numFmt w:val="bullet"/>
+      <w:lvlText w:val=""/>
+      <w:lvlJc w:val="left"/>
+      <w:pPr>
+        <w:tabs>
+          <w:tab w:val="num" w:pos="4320"/>
+        </w:tabs>
+        <w:ind w:left="4320" w:hanging="360"/>
+      </w:pPr>
+      <w:rPr>
+        <w:rFonts w:ascii="Wingdings" w:hAnsi="Wingdings" w:hint="default"/>
+        <w:sz w:val="20"/>
+      </w:rPr>
+    </w:lvl>
+    <w:lvl w:ilvl="6" w:tentative="1">
+      <w:start w:val="1"/>
+      <w:numFmt w:val="bullet"/>
+      <w:lvlText w:val=""/>
+      <w:lvlJc w:val="left"/>
+      <w:pPr>
+        <w:tabs>
+          <w:tab w:val="num" w:pos="5040"/>
+        </w:tabs>
+        <w:ind w:left="5040" w:hanging="360"/>
+      </w:pPr>
+      <w:rPr>
+        <w:rFonts w:ascii="Wingdings" w:hAnsi="Wingdings" w:hint="default"/>
+        <w:sz w:val="20"/>
+      </w:rPr>
+    </w:lvl>
+    <w:lvl w:ilvl="7" w:tentative="1">
+      <w:start w:val="1"/>
+      <w:numFmt w:val="bullet"/>
+      <w:lvlText w:val=""/>
+      <w:lvlJc w:val="left"/>
+      <w:pPr>
+        <w:tabs>
+          <w:tab w:val="num" w:pos="5760"/>
+        </w:tabs>
+        <w:ind w:left="5760" w:hanging="360"/>
+      </w:pPr>
+      <w:rPr>
+        <w:rFonts w:ascii="Wingdings" w:hAnsi="Wingdings" w:hint="default"/>
+        <w:sz w:val="20"/>
+      </w:rPr>
+    </w:lvl>
+    <w:lvl w:ilvl="8" w:tentative="1">
+      <w:start w:val="1"/>
+      <w:numFmt w:val="bullet"/>
+      <w:lvlText w:val=""/>
+      <w:lvlJc w:val="left"/>
+      <w:pPr>
+        <w:tabs>
+          <w:tab w:val="num" w:pos="6480"/>
+        </w:tabs>
+        <w:ind w:left="6480" w:hanging="360"/>
+      </w:pPr>
+      <w:rPr>
+        <w:rFonts w:ascii="Wingdings" w:hAnsi="Wingdings" w:hint="default"/>
+        <w:sz w:val="20"/>
+      </w:rPr>
+    </w:lvl>
+  </w:abstractNum>
+  <w:abstractNum w:abstractNumId="6" w15:restartNumberingAfterBreak="0">
     <w:nsid w:val="6AA873E8"/>
     <w:multiLevelType w:val="multilevel"/>
     <w:tmpl w:val="D47A001E"/>
@@ -2771,7 +3327,7 @@
       </w:rPr>
     </w:lvl>
   </w:abstractNum>
-  <w:abstractNum w:abstractNumId="5" w15:restartNumberingAfterBreak="0">
+  <w:abstractNum w:abstractNumId="7" w15:restartNumberingAfterBreak="0">
     <w:nsid w:val="769E5D17"/>
     <w:multiLevelType w:val="multilevel"/>
     <w:tmpl w:val="01DA761E"/>
@@ -2920,7 +3476,7 @@
       </w:rPr>
     </w:lvl>
   </w:abstractNum>
-  <w:abstractNum w:abstractNumId="6" w15:restartNumberingAfterBreak="0">
+  <w:abstractNum w:abstractNumId="8" w15:restartNumberingAfterBreak="0">
     <w:nsid w:val="7841209D"/>
     <w:multiLevelType w:val="multilevel"/>
     <w:tmpl w:val="B5D2EE40"/>
@@ -3069,7 +3625,7 @@
       </w:rPr>
     </w:lvl>
   </w:abstractNum>
-  <w:abstractNum w:abstractNumId="7" w15:restartNumberingAfterBreak="0">
+  <w:abstractNum w:abstractNumId="9" w15:restartNumberingAfterBreak="0">
     <w:nsid w:val="7D4F0FFE"/>
     <w:multiLevelType w:val="multilevel"/>
     <w:tmpl w:val="61B25682"/>
@@ -3218,7 +3774,7 @@
       </w:rPr>
     </w:lvl>
   </w:abstractNum>
-  <w:abstractNum w:abstractNumId="8" w15:restartNumberingAfterBreak="0">
+  <w:abstractNum w:abstractNumId="10" w15:restartNumberingAfterBreak="0">
     <w:nsid w:val="7F176967"/>
     <w:multiLevelType w:val="multilevel"/>
     <w:tmpl w:val="E5CEA278"/>
@@ -3368,19 +3924,19 @@
     </w:lvl>
   </w:abstractNum>
   <w:num w:numId="1" w16cid:durableId="1014573387">
-    <w:abstractNumId w:val="8"/>
+    <w:abstractNumId w:val="10"/>
   </w:num>
   <w:num w:numId="2" w16cid:durableId="1080130769">
     <w:abstractNumId w:val="2"/>
   </w:num>
   <w:num w:numId="3" w16cid:durableId="1651978068">
-    <w:abstractNumId w:val="4"/>
+    <w:abstractNumId w:val="6"/>
   </w:num>
   <w:num w:numId="4" w16cid:durableId="1103576587">
     <w:abstractNumId w:val="3"/>
   </w:num>
   <w:num w:numId="5" w16cid:durableId="1650136767">
-    <w:abstractNumId w:val="5"/>
+    <w:abstractNumId w:val="7"/>
   </w:num>
   <w:num w:numId="6" w16cid:durableId="266423625">
     <w:abstractNumId w:val="1"/>
@@ -3389,10 +3945,16 @@
     <w:abstractNumId w:val="0"/>
   </w:num>
   <w:num w:numId="8" w16cid:durableId="1407192481">
-    <w:abstractNumId w:val="6"/>
+    <w:abstractNumId w:val="8"/>
   </w:num>
   <w:num w:numId="9" w16cid:durableId="157229570">
-    <w:abstractNumId w:val="7"/>
+    <w:abstractNumId w:val="9"/>
+  </w:num>
+  <w:num w:numId="10" w16cid:durableId="1784811916">
+    <w:abstractNumId w:val="5"/>
+  </w:num>
+  <w:num w:numId="11" w16cid:durableId="1977830626">
+    <w:abstractNumId w:val="4"/>
   </w:num>
 </w:numbering>
 </file>

</xml_diff>